<commit_message>
feat: explain the mechanism, map the competition and cut the tech slide
The science slide never said what FSRS is — it read as jargon. It now leads with the
forgetting curve and explains, in three lines, that the algorithm estimates how long a memory
lasts in that person and brings the card back just before the drop.

The competitive table became a quadrant: measures forgetting over time against returns it to
the teacher. The empty corner is the argument, and it survives a judge who knows the market
better than a six-row table does.

The script now opens every slide with what the slide is arguing, so the speaker carries the
reasoning instead of reciting loose numbers.
</commit_message>
<xml_diff>
--- a/docs/pitch/Memfeed-Roteiro-Speaker.docx
+++ b/docs/pitch/Memfeed-Roteiro-Speaker.docx
@@ -135,6 +135,25 @@
     </w:p>
     <w:p>
       <w:pPr>
+        <w:pStyle w:val="Ponto"/>
+        <w:shd w:val="clear" w:fill="ECFDF5"/>
+      </w:pPr>
+      <w:r>
+        <w:rPr>
+          <w:b/>
+          <w:color w:val="059669"/>
+        </w:rPr>
+        <w:t xml:space="preserve">O ponto deste slide: </w:t>
+      </w:r>
+      <w:r>
+        <w:rPr>
+          <w:b w:val="0"/>
+        </w:rPr>
+        <w:t>Abrir com a lacuna, não com o produto. O júri precisa sentir a pergunta sem resposta — *quanto sobrou daquela aula?* — antes de ver qualquer tela. Se ele sair do slide 1 com essa pergunta na cabeça, o resto do pitch é a resposta.</w:t>
+      </w:r>
+    </w:p>
+    <w:p>
+      <w:pPr>
         <w:pStyle w:val="Palco"/>
       </w:pPr>
       <w:r>
@@ -231,6 +250,37 @@
           <w:b w:val="0"/>
         </w:rPr>
         <w:t>Slide 2 · O dado que nos move — 83% · 25s</w:t>
+      </w:r>
+    </w:p>
+    <w:p>
+      <w:pPr>
+        <w:pStyle w:val="Ponto"/>
+        <w:shd w:val="clear" w:fill="ECFDF5"/>
+      </w:pPr>
+      <w:r>
+        <w:rPr>
+          <w:b/>
+          <w:color w:val="059669"/>
+        </w:rPr>
+        <w:t xml:space="preserve">O ponto deste slide: </w:t>
+      </w:r>
+      <w:r>
+        <w:rPr>
+          <w:b w:val="0"/>
+        </w:rPr>
+        <w:t xml:space="preserve">Provar que a IA, do jeito que o aluno usa hoje, </w:t>
+      </w:r>
+      <w:r>
+        <w:rPr>
+          <w:b/>
+        </w:rPr>
+        <w:t>piora</w:t>
+      </w:r>
+      <w:r>
+        <w:rPr>
+          <w:b w:val="0"/>
+        </w:rPr>
+        <w:t xml:space="preserve"> a memória. Os 83% não são um dado sobre tecnologia: são a evidência de que atalho cognitivo cobra juros. É o que justifica um produto que devolve esforço em vez de poupá-lo.</w:t>
       </w:r>
     </w:p>
     <w:p>
@@ -338,6 +388,25 @@
           <w:b w:val="0"/>
         </w:rPr>
         <w:t>Slide 3 · O problema — três falhas · 25s</w:t>
+      </w:r>
+    </w:p>
+    <w:p>
+      <w:pPr>
+        <w:pStyle w:val="Ponto"/>
+        <w:shd w:val="clear" w:fill="ECFDF5"/>
+      </w:pPr>
+      <w:r>
+        <w:rPr>
+          <w:b/>
+          <w:color w:val="059669"/>
+        </w:rPr>
+        <w:t xml:space="preserve">O ponto deste slide: </w:t>
+      </w:r>
+      <w:r>
+        <w:rPr>
+          <w:b w:val="0"/>
+        </w:rPr>
+        <w:t>Mostrar que as três falhas se alimentam: atenção curta, IA como atalho e estudo por releitura. E fechar apontando para o professor — ele é quem fica no escuro, e é a dor que o nosso painel resolve. Este slide monta a persona do slide seguinte.</w:t>
       </w:r>
     </w:p>
     <w:p>
@@ -472,6 +541,49 @@
     </w:p>
     <w:p>
       <w:pPr>
+        <w:pStyle w:val="Ponto"/>
+        <w:shd w:val="clear" w:fill="ECFDF5"/>
+      </w:pPr>
+      <w:r>
+        <w:rPr>
+          <w:b/>
+          <w:color w:val="059669"/>
+        </w:rPr>
+        <w:t xml:space="preserve">O ponto deste slide: </w:t>
+      </w:r>
+      <w:r>
+        <w:rPr>
+          <w:b w:val="0"/>
+        </w:rPr>
+        <w:t xml:space="preserve">Ancorar na Lei 15.100. O celular está proibido na escola </w:t>
+      </w:r>
+      <w:r>
+        <w:rPr>
+          <w:b/>
+        </w:rPr>
+        <w:t>exceto para fim pedagógico sob orientação do professor</w:t>
+      </w:r>
+      <w:r>
+        <w:rPr>
+          <w:b w:val="0"/>
+        </w:rPr>
+        <w:t xml:space="preserve"> — e como quem publica o conteúdo é o professor, usar o Memfeed </w:t>
+      </w:r>
+      <w:r>
+        <w:rPr>
+          <w:b/>
+        </w:rPr>
+        <w:t>é</w:t>
+      </w:r>
+      <w:r>
+        <w:rPr>
+          <w:b w:val="0"/>
+        </w:rPr>
+        <w:t xml:space="preserve"> essa exceção, não uma brecha nela. Esse é o argumento que abre porta de escola pública.</w:t>
+      </w:r>
+    </w:p>
+    <w:p>
+      <w:pPr>
         <w:pStyle w:val="Palco"/>
       </w:pPr>
       <w:r>
@@ -609,6 +721,37 @@
           <w:b w:val="0"/>
         </w:rPr>
         <w:t>Slide 5 · A solução — duas origens, uma fila · 45s</w:t>
+      </w:r>
+    </w:p>
+    <w:p>
+      <w:pPr>
+        <w:pStyle w:val="Ponto"/>
+        <w:shd w:val="clear" w:fill="ECFDF5"/>
+      </w:pPr>
+      <w:r>
+        <w:rPr>
+          <w:b/>
+          <w:color w:val="059669"/>
+        </w:rPr>
+        <w:t xml:space="preserve">O ponto deste slide: </w:t>
+      </w:r>
+      <w:r>
+        <w:rPr>
+          <w:b w:val="0"/>
+        </w:rPr>
+        <w:t xml:space="preserve">Explicar a arquitetura do produto em uma imagem: duas origens, uma fila. O ponto que não pode escapar é que as duas caem no </w:t>
+      </w:r>
+      <w:r>
+        <w:rPr>
+          <w:b/>
+        </w:rPr>
+        <w:t>mesmo</w:t>
+      </w:r>
+      <w:r>
+        <w:rPr>
+          <w:b w:val="0"/>
+        </w:rPr>
+        <w:t xml:space="preserve"> FSRS — é isso que faz ser um produto só, e não um quiz do professor colado num app de estudo.</w:t>
       </w:r>
     </w:p>
     <w:p>
@@ -788,6 +931,25 @@
     </w:p>
     <w:p>
       <w:pPr>
+        <w:pStyle w:val="Ponto"/>
+        <w:shd w:val="clear" w:fill="ECFDF5"/>
+      </w:pPr>
+      <w:r>
+        <w:rPr>
+          <w:b/>
+          <w:color w:val="059669"/>
+        </w:rPr>
+        <w:t xml:space="preserve">O ponto deste slide: </w:t>
+      </w:r>
+      <w:r>
+        <w:rPr>
+          <w:b w:val="0"/>
+        </w:rPr>
+        <w:t>O coração do pitch. Todo mundo sabe o acerto no dia da atividade. Ninguém devolve ao professor quanto sobrou uma semana depois. Fale o número devagar: 96% no dia, 77% em D+7. A queda de 19 pontos é o que dispara a ação — não é relatório para arquivar, é gatilho de intervenção.</w:t>
+      </w:r>
+    </w:p>
+    <w:p>
+      <w:pPr>
         <w:pStyle w:val="Palco"/>
       </w:pPr>
       <w:r>
@@ -964,6 +1126,37 @@
     </w:p>
     <w:p>
       <w:pPr>
+        <w:pStyle w:val="Ponto"/>
+        <w:shd w:val="clear" w:fill="ECFDF5"/>
+      </w:pPr>
+      <w:r>
+        <w:rPr>
+          <w:b/>
+          <w:color w:val="059669"/>
+        </w:rPr>
+        <w:t xml:space="preserve">O ponto deste slide: </w:t>
+      </w:r>
+      <w:r>
+        <w:rPr>
+          <w:b w:val="0"/>
+        </w:rPr>
+        <w:t xml:space="preserve">Aqui o júri precisa entender </w:t>
+      </w:r>
+      <w:r>
+        <w:rPr>
+          <w:b/>
+        </w:rPr>
+        <w:t>o que é FSRS</w:t>
+      </w:r>
+      <w:r>
+        <w:rPr>
+          <w:b w:val="0"/>
+        </w:rPr>
+        <w:t>, senão o resto vira jargão. Explique como se fosse para a sua mãe: é um algoritmo que, a cada resposta, estima quanto tempo aquela memória dura em você, e traz o card de volta pouco antes de você esquecer. Mostre a curva. E seja honesto: o algoritmo é aberto e comum — o diferencial nunca foi o motor.</w:t>
+      </w:r>
+    </w:p>
+    <w:p>
+      <w:pPr>
         <w:pStyle w:val="Palco"/>
       </w:pPr>
       <w:r>
@@ -976,52 +1169,36 @@
         <w:rPr>
           <w:b w:val="0"/>
         </w:rPr>
-        <w:t xml:space="preserve"> tabela — estudo · achado · o que decide no produto.</w:t>
+        <w:t xml:space="preserve"> à esquerda, a curva de esquecimento — pontilhada cinza sem revisão, verde com o card voltando nos dias 1, 3, 7 e 16. À direita, o que é o FSRS em três parágrafos. Embaixo, os três estudos.</w:t>
       </w:r>
     </w:p>
     <w:p>
       <w:pPr>
-        <w:pStyle w:val="Fala"/>
-      </w:pPr>
+        <w:pStyle w:val="Palco"/>
+      </w:pPr>
+      <w:r>
+        <w:rPr>
+          <w:b/>
+        </w:rPr>
+        <w:t>Fala:</w:t>
+      </w:r>
       <w:r>
         <w:rPr>
           <w:b w:val="0"/>
         </w:rPr>
-        <w:t>Nada disso é invenção nossa. Cada decisão tem um estudo atrás.</w:t>
-      </w:r>
-    </w:p>
-    <w:p>
-      <w:pPr>
-        <w:pStyle w:val="Fala"/>
-      </w:pPr>
-      <w:r>
-        <w:rPr>
-          <w:b w:val="0"/>
-        </w:rPr>
-        <w:t>Roediger e Karpicke definem que o card é pergunta, nunca releitura. Cepeda define que o espaçamento é o núcleo. Murre e Dros dizem quando o card precisa voltar.</w:t>
-      </w:r>
-    </w:p>
-    <w:p>
-      <w:pPr>
-        <w:pStyle w:val="Fala"/>
-      </w:pPr>
-      <w:r>
-        <w:rPr>
-          <w:b w:val="0"/>
-        </w:rPr>
-        <w:t xml:space="preserve">E seja honesto comigo sobre uma coisa: (pausa) o </w:t>
+        <w:t xml:space="preserve"> "Uma palavra que vocês vão ouvir de novo: </w:t>
       </w:r>
       <w:r>
         <w:rPr>
           <w:b/>
         </w:rPr>
-        <w:t>FSRS é aberto</w:t>
+        <w:t>FSRS</w:t>
       </w:r>
       <w:r>
         <w:rPr>
           <w:b w:val="0"/>
         </w:rPr>
-        <w:t>. É o algoritmo padrão do Anki desde 2023. Qualquer time aqui copia o motor numa semana.</w:t>
+        <w:t>. (pausa)</w:t>
       </w:r>
     </w:p>
     <w:p>
@@ -1032,30 +1209,86 @@
         <w:rPr>
           <w:b w:val="0"/>
         </w:rPr>
-        <w:t xml:space="preserve">A gente usa o commodity </w:t>
+        <w:t>Free Spaced Repetition Scheduler. É um algoritmo aberto — o mesmo que o Anki adotou como padrão desde 2023.</w:t>
+      </w:r>
+    </w:p>
+    <w:p>
+      <w:pPr>
+        <w:pStyle w:val="Fala"/>
+      </w:pPr>
+      <w:r>
+        <w:rPr>
+          <w:b w:val="0"/>
+        </w:rPr>
+        <w:t xml:space="preserve">O que ele faz, em uma frase: a cada resposta, ele estima </w:t>
       </w:r>
       <w:r>
         <w:rPr>
           <w:b/>
         </w:rPr>
-        <w:t>de propósito</w:t>
+        <w:t>quanto tempo aquela memória dura em você</w:t>
       </w:r>
       <w:r>
         <w:rPr>
           <w:b w:val="0"/>
         </w:rPr>
-        <w:t>. O motor nunca foi o diferencial — e dizer o contrário não sobreviveria à primeira pergunta de vocês.</w:t>
+        <w:t xml:space="preserve"> — e marca o card para voltar pouco antes da queda.</w:t>
       </w:r>
     </w:p>
     <w:p>
       <w:pPr>
-        <w:pStyle w:val="Palco"/>
+        <w:pStyle w:val="Fala"/>
       </w:pPr>
       <w:r>
         <w:rPr>
           <w:b w:val="0"/>
         </w:rPr>
-        <w:t>`→ AVANÇA O SLIDE`</w:t>
+        <w:t>Errou, volta em minutos. Acertou sem esforço, volta daqui a semanas. (pausa)</w:t>
+      </w:r>
+    </w:p>
+    <w:p>
+      <w:pPr>
+        <w:pStyle w:val="Fala"/>
+      </w:pPr>
+      <w:r>
+        <w:rPr>
+          <w:b w:val="0"/>
+        </w:rPr>
+        <w:t>Essa é a linha pontilhada: o que acontece sem revisão. E essa é a verde: o mesmo conteúdo, com o card voltando na hora certa.</w:t>
+      </w:r>
+    </w:p>
+    <w:p>
+      <w:pPr>
+        <w:pStyle w:val="Fala"/>
+      </w:pPr>
+      <w:r>
+        <w:rPr>
+          <w:b w:val="0"/>
+        </w:rPr>
+        <w:t xml:space="preserve">E eu quero ser honesto com vocês: o algoritmo é commodity. </w:t>
+      </w:r>
+      <w:r>
+        <w:rPr>
+          <w:b/>
+        </w:rPr>
+        <w:t>O motor nunca foi o nosso diferencial</w:t>
+      </w:r>
+      <w:r>
+        <w:rPr>
+          <w:b w:val="0"/>
+        </w:rPr>
+        <w:t xml:space="preserve"> — o diferencial é o que a gente faz com o que ele mede."</w:t>
+      </w:r>
+    </w:p>
+    <w:p>
+      <w:pPr>
+        <w:pStyle w:val="Palco"/>
+      </w:pPr>
+      <w:r>
+        <w:rPr>
+          <w:b w:val="0"/>
+        </w:rPr>
+        <w:t>Aponte a curva pontilhada ao dizer "sem revisão" e a verde ao dizer "na hora certa". A frase sobre commodity é desarme preventivo: não deixe um jurado dizer isso antes de você. Deixa: "Então por que ninguém já fez?"</w:t>
       </w:r>
     </w:p>
     <w:p>
@@ -1067,6 +1300,37 @@
           <w:b w:val="0"/>
         </w:rPr>
         <w:t>Slide 8 · Cenário competitivo · 30s</w:t>
+      </w:r>
+    </w:p>
+    <w:p>
+      <w:pPr>
+        <w:pStyle w:val="Ponto"/>
+        <w:shd w:val="clear" w:fill="ECFDF5"/>
+      </w:pPr>
+      <w:r>
+        <w:rPr>
+          <w:b/>
+          <w:color w:val="059669"/>
+        </w:rPr>
+        <w:t xml:space="preserve">O ponto deste slide: </w:t>
+      </w:r>
+      <w:r>
+        <w:rPr>
+          <w:b w:val="0"/>
+        </w:rPr>
+        <w:t xml:space="preserve">Desarmar o jurado que conhece o mercado, admitindo antes dele. Todos são melhores que nós em alguma coisa. O que ninguém ocupa é o canto onde as duas coisas acontecem juntas: medir o esquecimento </w:t>
+      </w:r>
+      <w:r>
+        <w:rPr>
+          <w:b/>
+        </w:rPr>
+        <w:t>e</w:t>
+      </w:r>
+      <w:r>
+        <w:rPr>
+          <w:b w:val="0"/>
+        </w:rPr>
+        <w:t xml:space="preserve"> devolver ao professor. Cite o Seneca de propósito — mostra que você pesquisou de verdade e que não está atacando o alvo fácil.</w:t>
       </w:r>
     </w:p>
     <w:p>
@@ -1083,18 +1347,24 @@
         <w:rPr>
           <w:b w:val="0"/>
         </w:rPr>
-        <w:t xml:space="preserve"> tabela com Kahoot, Wayground, Seneca, Anki, Plurall e Memfeed.</w:t>
+        <w:t xml:space="preserve"> quadrante. Eixo horizontal *mede o esquecimento no tempo*, vertical *devolve ao professor*. Seis produtos plotados; o canto superior direito destacado, com o Memfeed sozinho nele.</w:t>
       </w:r>
     </w:p>
     <w:p>
       <w:pPr>
-        <w:pStyle w:val="Fala"/>
-      </w:pPr>
+        <w:pStyle w:val="Palco"/>
+      </w:pPr>
+      <w:r>
+        <w:rPr>
+          <w:b/>
+        </w:rPr>
+        <w:t>Fala:</w:t>
+      </w:r>
       <w:r>
         <w:rPr>
           <w:b w:val="0"/>
         </w:rPr>
-        <w:t>Então o que é o diferencial? Olha a tabela.</w:t>
+        <w:t xml:space="preserve"> "Esse é o mapa da concorrência, e ele tem dois eixos. (pausa)</w:t>
       </w:r>
     </w:p>
     <w:p>
@@ -1105,19 +1375,41 @@
         <w:rPr>
           <w:b w:val="0"/>
         </w:rPr>
-        <w:t xml:space="preserve">Kahoot gera questão de um assunto, melhor que a gente. Mas a própria central de ajuda dele diz: </w:t>
+        <w:t xml:space="preserve">Horizontal: o produto mede o esquecimento ao longo do tempo? Vertical: ele devolve isso </w:t>
       </w:r>
       <w:r>
         <w:rPr>
           <w:b/>
         </w:rPr>
-        <w:t>estudo solo não gera relatório</w:t>
+        <w:t>ao professor</w:t>
       </w:r>
       <w:r>
         <w:rPr>
           <w:b w:val="0"/>
         </w:rPr>
-        <w:t>. E o post oficial de março instrui o professor a criar um novo kahoot e lembrar de rodar "uma ou duas semanas depois". Esse "lembrar" é trabalho manual.</w:t>
+        <w:t>?</w:t>
+      </w:r>
+    </w:p>
+    <w:p>
+      <w:pPr>
+        <w:pStyle w:val="Fala"/>
+      </w:pPr>
+      <w:r>
+        <w:rPr>
+          <w:b w:val="0"/>
+        </w:rPr>
+        <w:t>O Kahoot e o Wayground estão aqui em cima à esquerda — têm relatório bom, mas do dia da atividade.</w:t>
+      </w:r>
+    </w:p>
+    <w:p>
+      <w:pPr>
+        <w:pStyle w:val="Fala"/>
+      </w:pPr>
+      <w:r>
+        <w:rPr>
+          <w:b w:val="0"/>
+        </w:rPr>
+        <w:t>O Anki e o Seneca estão à direita embaixo — medem esquecimento de verdade, e entregam só ao aluno.</w:t>
       </w:r>
     </w:p>
     <w:p>
@@ -1140,13 +1432,7 @@
         <w:rPr>
           <w:b w:val="0"/>
         </w:rPr>
-        <w:t xml:space="preserve">. Ele já usa a curva de esquecimento de Ebbinghaus para agendar a revisão do aluno. (pausa) E mesmo assim, o painel do professor entrega conclusão de tarefa, nota e tempo de estudo. </w:t>
-      </w:r>
-      <w:r>
-        <w:rPr>
-          <w:b/>
-        </w:rPr>
-        <w:t>A curva morre no motor. Ela nunca vira relatório.</w:t>
+        <w:t>, que já usa a curva de Ebbinghaus para agendar a revisão. Mesmo ele nunca devolve a curva ao professor — o painel dele mostra conclusão, nota e tempo de estudo. (pausa)</w:t>
       </w:r>
     </w:p>
     <w:p>
@@ -1157,41 +1443,48 @@
         <w:rPr>
           <w:b w:val="0"/>
         </w:rPr>
-        <w:t xml:space="preserve">É essa coluna que está vazia no mercado. Não o algoritmo — a </w:t>
+        <w:t>O canto superior direito está vazio. É onde a gente está."</w:t>
       </w:r>
+    </w:p>
+    <w:p>
+      <w:pPr>
+        <w:pStyle w:val="Palco"/>
+      </w:pPr>
+      <w:r>
+        <w:rPr>
+          <w:b w:val="0"/>
+        </w:rPr>
+        <w:t>Aponte fisicamente os quatro cantos enquanto fala. Citar o Seneca como o mais perigoso mostra pesquisa real e tira do jurado a chance de te pegar. Deixa: "E a tecnologia por trás disso não prende a gente a ninguém."</w:t>
+      </w:r>
+    </w:p>
+    <w:p>
+      <w:pPr>
+        <w:pStyle w:val="CabecalhoSlide"/>
+      </w:pPr>
+      <w:r>
+        <w:rPr>
+          <w:b w:val="0"/>
+        </w:rPr>
+        <w:t>Slide 9 · Tecnologia · 20s</w:t>
+      </w:r>
+    </w:p>
+    <w:p>
+      <w:pPr>
+        <w:pStyle w:val="Ponto"/>
+        <w:shd w:val="clear" w:fill="ECFDF5"/>
+      </w:pPr>
       <w:r>
         <w:rPr>
           <w:b/>
+          <w:color w:val="059669"/>
         </w:rPr>
-        <w:t>tradução</w:t>
+        <w:t xml:space="preserve">O ponto deste slide: </w:t>
       </w:r>
       <w:r>
         <w:rPr>
           <w:b w:val="0"/>
         </w:rPr>
-        <w:t xml:space="preserve"> do algoritmo para quem deu a aula.</w:t>
-      </w:r>
-    </w:p>
-    <w:p>
-      <w:pPr>
-        <w:pStyle w:val="Palco"/>
-      </w:pPr>
-      <w:r>
-        <w:rPr>
-          <w:b w:val="0"/>
-        </w:rPr>
-        <w:t>`→ AVANÇA O SLIDE`</w:t>
-      </w:r>
-    </w:p>
-    <w:p>
-      <w:pPr>
-        <w:pStyle w:val="CabecalhoSlide"/>
-      </w:pPr>
-      <w:r>
-        <w:rPr>
-          <w:b w:val="0"/>
-        </w:rPr>
-        <w:t>Slide 9 · Tecnologia · 20s</w:t>
+        <w:t>Tirar o risco de fornecedor da mesa em vinte segundos. Trocar de LLM é variável de ambiente, não reescrita. E a decisão que vale repetir: a figura do card vem do acervo da Wikipédia, nunca de modelo de imagem — porque diagrama científico gerado por IA sai errado, e num app de educação erro se propaga pela fila de revisão.</w:t>
       </w:r>
     </w:p>
     <w:p>
@@ -1208,18 +1501,24 @@
         <w:rPr>
           <w:b w:val="0"/>
         </w:rPr>
-        <w:t xml:space="preserve"> três cartões — geração agnóstica de provedor · a Wikipédia · a stack. Faixa embaixo: no ar hoje × o que vem depois.</w:t>
+        <w:t xml:space="preserve"> três cartões — modelo trocável, a figura vinda do acervo (destacado), e a stack.</w:t>
       </w:r>
     </w:p>
     <w:p>
       <w:pPr>
-        <w:pStyle w:val="Fala"/>
-      </w:pPr>
+        <w:pStyle w:val="Palco"/>
+      </w:pPr>
+      <w:r>
+        <w:rPr>
+          <w:b/>
+        </w:rPr>
+        <w:t>Fala:</w:t>
+      </w:r>
       <w:r>
         <w:rPr>
           <w:b w:val="0"/>
         </w:rPr>
-        <w:t>Rápido sobre a técnica, porque tem uma decisão aqui que eu quero que fique.</w:t>
+        <w:t xml:space="preserve"> "Três coisas, rápido. (pausa)</w:t>
       </w:r>
     </w:p>
     <w:p>
@@ -1230,31 +1529,42 @@
         <w:rPr>
           <w:b w:val="0"/>
         </w:rPr>
-        <w:t xml:space="preserve">A geração é </w:t>
+        <w:t xml:space="preserve">Um: trocar de modelo de IA aqui é mudar uma variável de ambiente. Duas implementações da mesma interface, e a saída passa por validação de schema antes de virar card. Hoje roda no </w:t>
       </w:r>
       <w:r>
         <w:rPr>
           <w:b/>
         </w:rPr>
-        <w:t>agnóstica de provedor</w:t>
+        <w:t>tier gratuito</w:t>
       </w:r>
       <w:r>
         <w:rPr>
           <w:b w:val="0"/>
         </w:rPr>
-        <w:t xml:space="preserve">. Uma interface, duas implementações — Anthropic e Gemini — escolhidas pela chave que está no ambiente. A saída passa por JSON schema antes de virar card. Hoje roda no </w:t>
+        <w:t xml:space="preserve"> do Gemini — o custo de inferência é substituível, não estrutural.</w:t>
+      </w:r>
+    </w:p>
+    <w:p>
+      <w:pPr>
+        <w:pStyle w:val="Fala"/>
+      </w:pPr>
+      <w:r>
+        <w:rPr>
+          <w:b w:val="0"/>
+        </w:rPr>
+        <w:t xml:space="preserve">Dois, e essa é a decisão que nos separa: </w:t>
       </w:r>
       <w:r>
         <w:rPr>
           <w:b/>
         </w:rPr>
-        <w:t>tier gratuito do Gemini</w:t>
+        <w:t>a figura de cada card vem do acervo da Wikipédia. Nunca de modelo de imagem.</w:t>
       </w:r>
       <w:r>
         <w:rPr>
           <w:b w:val="0"/>
         </w:rPr>
-        <w:t>: o custo de inferência é substituível, não estrutural.</w:t>
+        <w:t xml:space="preserve"> Diagrama científico gerado por IA sai com a seta trocada e a molécula inventada. Num app de educação isso ensina errado — e o erro se propaga justamente pela fila de revisão, que é o que fixa memória.</w:t>
       </w:r>
     </w:p>
     <w:p>
@@ -1265,41 +1575,60 @@
         <w:rPr>
           <w:b w:val="0"/>
         </w:rPr>
-        <w:t xml:space="preserve">E a figura de cada card vem do </w:t>
+        <w:t>Três: a stack é aberta das duas pontas, com a mesma API servindo o aluno e o professor."</w:t>
+      </w:r>
+    </w:p>
+    <w:p>
+      <w:pPr>
+        <w:pStyle w:val="Palco"/>
+      </w:pPr>
+      <w:r>
+        <w:rPr>
+          <w:b w:val="0"/>
+        </w:rPr>
+        <w:t>O item dois é o que fica na cabeça do jurado — diga devagar. Deixa: "E como isso se sustenta?"</w:t>
+      </w:r>
+    </w:p>
+    <w:p>
+      <w:pPr>
+        <w:pStyle w:val="CabecalhoSlide"/>
+      </w:pPr>
+      <w:r>
+        <w:rPr>
+          <w:b w:val="0"/>
+        </w:rPr>
+        <w:t>Slide 10 · Modelo de negócio e fecho · 20s</w:t>
+      </w:r>
+    </w:p>
+    <w:p>
+      <w:pPr>
+        <w:pStyle w:val="Ponto"/>
+        <w:shd w:val="clear" w:fill="ECFDF5"/>
+      </w:pPr>
+      <w:r>
+        <w:rPr>
+          <w:b/>
+          <w:color w:val="059669"/>
+        </w:rPr>
+        <w:t xml:space="preserve">O ponto deste slide: </w:t>
+      </w:r>
+      <w:r>
+        <w:rPr>
+          <w:b w:val="0"/>
+        </w:rPr>
+        <w:t xml:space="preserve">Fechar mostrando que a conta fecha </w:t>
       </w:r>
       <w:r>
         <w:rPr>
           <w:b/>
         </w:rPr>
-        <w:t>acervo da Wikipédia</w:t>
+        <w:t>por causa</w:t>
       </w:r>
       <w:r>
         <w:rPr>
           <w:b w:val="0"/>
         </w:rPr>
-        <w:t>. Nunca de modelo de imagem. (pausa) Porque diagrama científico gerado por IA sai com a seta trocada — e num app de educação, isso ensina errado.</w:t>
-      </w:r>
-    </w:p>
-    <w:p>
-      <w:pPr>
-        <w:pStyle w:val="Palco"/>
-      </w:pPr>
-      <w:r>
-        <w:rPr>
-          <w:b w:val="0"/>
-        </w:rPr>
-        <w:t>`→ AVANÇA O SLIDE`</w:t>
-      </w:r>
-    </w:p>
-    <w:p>
-      <w:pPr>
-        <w:pStyle w:val="CabecalhoSlide"/>
-      </w:pPr>
-      <w:r>
-        <w:rPr>
-          <w:b w:val="0"/>
-        </w:rPr>
-        <w:t>Slide 10 · Modelo de negócio e fecho · 20s</w:t>
+        <w:t xml:space="preserve"> da arquitetura, não apesar dela. A aula do professor é gerada uma vez e consumida por 34 alunos; a geração que o aluno pede é 1:1. Por isso a escola pública sai de graça sem quebrar o modelo. Termine no lema e segure o silêncio.</w:t>
       </w:r>
     </w:p>
     <w:p>
@@ -14921,6 +15250,20 @@
       <w:sz w:val="27"/>
     </w:rPr>
   </w:style>
+  <w:style w:type="paragraph" w:customStyle="1" w:styleId="Ponto">
+    <w:name w:val="Ponto"/>
+    <w:basedOn w:val="Normal"/>
+    <w:pPr>
+      <w:spacing w:before="40" w:after="140"/>
+    </w:pPr>
+    <w:rPr>
+      <w:rFonts w:ascii="Helvetica Neue" w:hAnsi="Helvetica Neue"/>
+      <w:b w:val="0"/>
+      <w:i w:val="0"/>
+      <w:color w:val="0F131D"/>
+      <w:sz w:val="22"/>
+    </w:rPr>
+  </w:style>
   <w:style w:type="paragraph" w:customStyle="1" w:styleId="Fala">
     <w:name w:val="Fala"/>
     <w:basedOn w:val="Normal"/>

</xml_diff>

<commit_message>
feat: trade the vendor slide for live proof and a QR the jury can scan
Nobody asks about vendor lock-in in a five-minute pitch. The question a hackathon jury
actually asks is whether the thing exists, so slide 9 now shows the panel and the app running
against the real API, and a QR that opens the demo in the judge's own browser.

The one claim worth keeping from the old slide stayed: the illustration comes from the
archive, never from an image model.

The QR URL lives in a single constant — regenerate with "node gerar-qr.js" once the deploy
has its address.
</commit_message>
<xml_diff>
--- a/docs/pitch/Memfeed-Roteiro-Speaker.docx
+++ b/docs/pitch/Memfeed-Roteiro-Speaker.docx
@@ -1364,7 +1364,19 @@
         <w:rPr>
           <w:b w:val="0"/>
         </w:rPr>
-        <w:t xml:space="preserve"> "Esse é o mapa da concorrência, e ele tem dois eixos. (pausa)</w:t>
+        <w:t xml:space="preserve"> "Vou começar admitindo: </w:t>
+      </w:r>
+      <w:r>
+        <w:rPr>
+          <w:b/>
+        </w:rPr>
+        <w:t>todos eles são melhores que a gente em alguma coisa.</w:t>
+      </w:r>
+      <w:r>
+        <w:rPr>
+          <w:b w:val="0"/>
+        </w:rPr>
+        <w:t xml:space="preserve"> (pausa) Esse é o mapa da concorrência, e ele tem dois eixos.</w:t>
       </w:r>
     </w:p>
     <w:p>
@@ -1465,7 +1477,7 @@
         <w:rPr>
           <w:b w:val="0"/>
         </w:rPr>
-        <w:t>Slide 9 · Tecnologia · 20s</w:t>
+        <w:t>Slide 9 · Prova viva — não é maquete · 25s</w:t>
       </w:r>
     </w:p>
     <w:p>
@@ -1484,7 +1496,7 @@
         <w:rPr>
           <w:b w:val="0"/>
         </w:rPr>
-        <w:t>Tirar o risco de fornecedor da mesa em vinte segundos. Trocar de LLM é variável de ambiente, não reescrita. E a decisão que vale repetir: a figura do card vem do acervo da Wikipédia, nunca de modelo de imagem — porque diagrama científico gerado por IA sai errado, e num app de educação erro se propaga pela fila de revisão.</w:t>
+        <w:t>Num hackathon a pergunta que o júri realmente faz é "vocês construíram mesmo?". Este slide responde antes de ser perguntado, e convida à verificação na hora: o QR abre no navegador do celular do jurado, sem instalar nada. Quem escaneia durante o pitch sai convencido de um jeito que nenhum slide convence.</w:t>
       </w:r>
     </w:p>
     <w:p>
@@ -1501,7 +1513,7 @@
         <w:rPr>
           <w:b w:val="0"/>
         </w:rPr>
-        <w:t xml:space="preserve"> três cartões — modelo trocável, a figura vinda do acervo (destacado), e a stack.</w:t>
+        <w:t xml:space="preserve"> o painel do professor grande à esquerda, duas telas do app à direita, o QR embaixo e três fatos curtos.</w:t>
       </w:r>
     </w:p>
     <w:p>
@@ -1518,7 +1530,7 @@
         <w:rPr>
           <w:b w:val="0"/>
         </w:rPr>
-        <w:t xml:space="preserve"> "Três coisas, rápido. (pausa)</w:t>
+        <w:t xml:space="preserve"> "E eu não vim mostrar maquete. (pausa)</w:t>
       </w:r>
     </w:p>
     <w:p>
@@ -1529,19 +1541,30 @@
         <w:rPr>
           <w:b w:val="0"/>
         </w:rPr>
-        <w:t xml:space="preserve">Um: trocar de modelo de IA aqui é mudar uma variável de ambiente. Duas implementações da mesma interface, e a saída passa por validação de schema antes de virar card. Hoje roda no </w:t>
+        <w:t>Isso aí é o painel rodando, com a turma de trinta e quatro alunos. Isso aqui é o app, com card gerado por IA. Os três estão no ar agora: app, painel e API.</w:t>
+      </w:r>
+    </w:p>
+    <w:p>
+      <w:pPr>
+        <w:pStyle w:val="Fala"/>
+      </w:pPr>
+      <w:r>
+        <w:rPr>
+          <w:b w:val="0"/>
+        </w:rPr>
+        <w:t xml:space="preserve">Se vocês quiserem conferir enquanto eu falo — </w:t>
       </w:r>
       <w:r>
         <w:rPr>
           <w:b/>
         </w:rPr>
-        <w:t>tier gratuito</w:t>
+        <w:t>aponta a câmera no QR</w:t>
       </w:r>
       <w:r>
         <w:rPr>
           <w:b w:val="0"/>
         </w:rPr>
-        <w:t xml:space="preserve"> do Gemini — o custo de inferência é substituível, não estrutural.</w:t>
+        <w:t>. Abre no navegador do celular de vocês, sem loja, sem instalar, sem cadastro. Um botão entra como aluno, outro como professor. (pausa)</w:t>
       </w:r>
     </w:p>
     <w:p>
@@ -1552,7 +1575,7 @@
         <w:rPr>
           <w:b w:val="0"/>
         </w:rPr>
-        <w:t xml:space="preserve">Dois, e essa é a decisão que nos separa: </w:t>
+        <w:t xml:space="preserve">E tem uma decisão ali que eu faço questão de dizer em voz alta: </w:t>
       </w:r>
       <w:r>
         <w:rPr>
@@ -1564,29 +1587,30 @@
         <w:rPr>
           <w:b w:val="0"/>
         </w:rPr>
-        <w:t xml:space="preserve"> Diagrama científico gerado por IA sai com a seta trocada e a molécula inventada. Num app de educação isso ensina errado — e o erro se propaga justamente pela fila de revisão, que é o que fixa memória.</w:t>
+        <w:t xml:space="preserve"> Diagrama científico gerado por IA sai com a seta trocada — e num app de educação isso ensina errado."</w:t>
       </w:r>
     </w:p>
     <w:p>
       <w:pPr>
-        <w:pStyle w:val="Fala"/>
+        <w:pStyle w:val="Palco"/>
       </w:pPr>
       <w:r>
         <w:rPr>
           <w:b w:val="0"/>
         </w:rPr>
-        <w:t>Três: a stack é aberta das duas pontas, com a mesma API servindo o aluno e o professor."</w:t>
+        <w:t xml:space="preserve">Diga "aponta a câmera" olhando para a plateia, não para o slide — e </w:t>
       </w:r>
-    </w:p>
-    <w:p>
-      <w:pPr>
-        <w:pStyle w:val="Palco"/>
-      </w:pPr>
+      <w:r>
+        <w:rPr>
+          <w:b/>
+        </w:rPr>
+        <w:t>pare de falar por dois segundos</w:t>
+      </w:r>
       <w:r>
         <w:rPr>
           <w:b w:val="0"/>
         </w:rPr>
-        <w:t>O item dois é o que fica na cabeça do jurado — diga devagar. Deixa: "E como isso se sustenta?"</w:t>
+        <w:t xml:space="preserve"> para as pessoas pegarem o celular. Se alguém escanear, você ganhou o pitch. Deixa: "E como isso se sustenta?"</w:t>
       </w:r>
     </w:p>
     <w:p>

</xml_diff>

<commit_message>
refactor: let the screens carry the proof slide
Three captioned screens of equal height and one wide QR block. The bullet list went to the
speech: a number read off a slide lands weaker than the same number spoken over the screen
that produced it, and the footnote about the capture was disclosure nobody asked for.
</commit_message>
<xml_diff>
--- a/docs/pitch/Memfeed-Roteiro-Speaker.docx
+++ b/docs/pitch/Memfeed-Roteiro-Speaker.docx
@@ -1541,7 +1541,19 @@
         <w:rPr>
           <w:b w:val="0"/>
         </w:rPr>
-        <w:t>Isso aí é o painel rodando, com a turma de trinta e quatro alunos. Isso aqui é o app, com card gerado por IA. Os três estão no ar agora: app, painel e API.</w:t>
+        <w:t xml:space="preserve">Isso aí é o painel rodando, com a turma de trinta e quatro alunos. Isso aqui é o app. São </w:t>
+      </w:r>
+      <w:r>
+        <w:rPr>
+          <w:b/>
+        </w:rPr>
+        <w:t>trinta e nove cards gerados por IA em seis matérias</w:t>
+      </w:r>
+      <w:r>
+        <w:rPr>
+          <w:b w:val="0"/>
+        </w:rPr>
+        <w:t>, e vinte e sete alunos já responderam. Os três estão no ar agora: app, painel e API.</w:t>
       </w:r>
     </w:p>
     <w:p>

</xml_diff>

<commit_message>
fix: make the dark band readable and stop stacking every slide at the top
The economics band renders dark on a light slide, so its text inherited the light-slide colour
and disappeared. The body of each slide now takes the free space instead of leaving it all
above the footer, and the revenue disclaimer moved to the script — it is an answer to hold,
not a line to project.
</commit_message>
<xml_diff>
--- a/docs/pitch/Memfeed-Roteiro-Speaker.docx
+++ b/docs/pitch/Memfeed-Roteiro-Speaker.docx
@@ -1634,6 +1634,23 @@
           <w:b w:val="0"/>
         </w:rPr>
         <w:t>Slide 10 · Modelo de negócio e fecho · 20s</w:t>
+      </w:r>
+    </w:p>
+    <w:p>
+      <w:pPr>
+        <w:pStyle w:val="Palco"/>
+      </w:pPr>
+      <w:r>
+        <w:rPr>
+          <w:b/>
+        </w:rPr>
+        <w:t>Se perguntarem de número:</w:t>
+      </w:r>
+      <w:r>
+        <w:rPr>
+          <w:b w:val="0"/>
+        </w:rPr>
+        <w:t xml:space="preserve"> não há projeção de receita em nenhum slide, e é de propósito — não há tração, não há usuário real, não há depoimento; o produto nasceu esta semana e o pedido é um piloto, não um contrato. Os preços citados (Quizlet Plus US$ 2,99/mês; cursinho ENEM do Descomplica 12× R$ 49,90) são referência de mercado verificada em 13/09/2026, usada como âncora e nunca como nosso preço. O contexto de mercado vem de PISA 2022 (INEP/OCDE) e do Censo Escolar 2025 (Inep).</w:t>
       </w:r>
     </w:p>
     <w:p>

</xml_diff>